<commit_message>
Page Navigation methods completed
</commit_message>
<xml_diff>
--- a/python_notes/Selenium_Python_Framework_Design.docx
+++ b/python_notes/Selenium_Python_Framework_Design.docx
@@ -328,8 +328,14 @@
     <w:p>
       <w:pPr>
         <w:spacing w:after="0" w:line="240" w:lineRule="auto"/>
-      </w:pPr>
-      <w:r>
+        <w:rPr>
+          <w:b/>
+        </w:rPr>
+      </w:pPr>
+      <w:r>
+        <w:rPr>
+          <w:b/>
+        </w:rPr>
         <w:t>Selenium Python Framework Implementation from Scratch:</w:t>
       </w:r>
     </w:p>
@@ -542,8 +548,14 @@
     <w:p>
       <w:pPr>
         <w:spacing w:after="0" w:line="240" w:lineRule="auto"/>
-      </w:pPr>
-      <w:r>
+        <w:rPr>
+          <w:b/>
+        </w:rPr>
+      </w:pPr>
+      <w:r>
+        <w:rPr>
+          <w:b/>
+        </w:rPr>
         <w:t>To run tests:</w:t>
       </w:r>
     </w:p>
@@ -552,7 +564,15 @@
         <w:spacing w:after="0" w:line="240" w:lineRule="auto"/>
       </w:pPr>
       <w:r>
-        <w:t>(.venv) C:\WorkspacePython\python-web-framework&gt;python -m pytest -v -s --browser=chrome --html=report\report.html</w:t>
+        <w:t>(.</w:t>
+      </w:r>
+      <w:proofErr w:type="spellStart"/>
+      <w:r>
+        <w:t>venv</w:t>
+      </w:r>
+      <w:proofErr w:type="spellEnd"/>
+      <w:r>
+        <w:t>) C:\WorkspacePython\python-web-framework&gt;python -m pytest -v -s --browser=chrome --html=report\report.html</w:t>
       </w:r>
     </w:p>
     <w:p>

</xml_diff>

<commit_message>
Parameterization with multiple data sets
</commit_message>
<xml_diff>
--- a/python_notes/Selenium_Python_Framework_Design.docx
+++ b/python_notes/Selenium_Python_Framework_Design.docx
@@ -461,6 +461,9 @@
       <w:r>
         <w:t>Parameteriging WebDriver tests with Multiple Data sets</w:t>
       </w:r>
+      <w:r>
+        <w:t xml:space="preserve"> using pytest parameterization using fixture</w:t>
+      </w:r>
     </w:p>
     <w:p>
       <w:pPr>
@@ -574,6 +577,71 @@
       <w:r>
         <w:t>) C:\WorkspacePython\python-web-framework&gt;python -m pytest -v -s --browser=chrome --html=report\report.html</w:t>
       </w:r>
+    </w:p>
+    <w:p>
+      <w:pPr>
+        <w:spacing w:after="0" w:line="240" w:lineRule="auto"/>
+      </w:pPr>
+    </w:p>
+    <w:p>
+      <w:pPr>
+        <w:spacing w:after="0" w:line="240" w:lineRule="auto"/>
+      </w:pPr>
+      <w:r>
+        <w:t>python -m pytest -v -s</w:t>
+      </w:r>
+      <w:r>
+        <w:t xml:space="preserve">  tests\test_e2e.py </w:t>
+      </w:r>
+      <w:r>
+        <w:t xml:space="preserve"> --browser=chrome --html=report\report.html</w:t>
+      </w:r>
+    </w:p>
+    <w:p>
+      <w:pPr>
+        <w:spacing w:after="0" w:line="240" w:lineRule="auto"/>
+      </w:pPr>
+      <w:r>
+        <w:t>python -m pytest -v -s  tests\test_</w:t>
+      </w:r>
+      <w:r>
+        <w:t>test_home_page</w:t>
+      </w:r>
+      <w:r>
+        <w:t>.py  --browser=chrome --html=report\report.html</w:t>
+      </w:r>
+    </w:p>
+    <w:p>
+      <w:pPr>
+        <w:spacing w:after="0" w:line="240" w:lineRule="auto"/>
+      </w:pPr>
+    </w:p>
+    <w:p>
+      <w:pPr>
+        <w:spacing w:after="0" w:line="240" w:lineRule="auto"/>
+      </w:pPr>
+      <w:r>
+        <w:lastRenderedPageBreak/>
+        <w:t>(.</w:t>
+      </w:r>
+      <w:proofErr w:type="spellStart"/>
+      <w:r>
+        <w:t>venv</w:t>
+      </w:r>
+      <w:proofErr w:type="spellEnd"/>
+      <w:r>
+        <w:t>) C:\WorkspacePython\python-web-framework&gt;python -m pytest -v -s  tests\test_home_page.py  --browser=chrome --html=report\report.html</w:t>
+      </w:r>
+    </w:p>
+    <w:p>
+      <w:pPr>
+        <w:spacing w:after="0" w:line="240" w:lineRule="auto"/>
+      </w:pPr>
+    </w:p>
+    <w:p>
+      <w:pPr>
+        <w:spacing w:after="0" w:line="240" w:lineRule="auto"/>
+      </w:pPr>
     </w:p>
     <w:p>
       <w:pPr>
@@ -1044,7 +1112,6 @@
   <w:style w:type="character" w:default="1" w:styleId="DefaultParagraphFont">
     <w:name w:val="Default Paragraph Font"/>
     <w:uiPriority w:val="1"/>
-    <w:semiHidden/>
     <w:unhideWhenUsed/>
   </w:style>
   <w:style w:type="table" w:default="1" w:styleId="TableNormal">

</xml_diff>